<commit_message>
Promote beta document translation fixes
</commit_message>
<xml_diff>
--- a/test_samples/sample_book.en.docx
+++ b/test_samples/sample_book.en.docx
@@ -62,4 +62,64 @@
     </w:tbl>
   </w:body>
 </w:document>
+</file>
+
+<file path=word/comments.xml><?xml version="1.0" encoding="utf-8"?>
+<w:document xmlns:w="http://schemas.openxmlformats.org/wordprocessingml/2006/main">
+  <w:body>
+    <w:p>
+      <w:r>
+        <w:t>Sample comment text</w:t>
+      </w:r>
+    </w:p>
+  </w:body>
+</w:document>
+</file>
+
+<file path=word/endnotes.xml><?xml version="1.0" encoding="utf-8"?>
+<w:document xmlns:w="http://schemas.openxmlformats.org/wordprocessingml/2006/main">
+  <w:body>
+    <w:p>
+      <w:r>
+        <w:t>Sample endnote text</w:t>
+      </w:r>
+    </w:p>
+  </w:body>
+</w:document>
+</file>
+
+<file path=word/footer1.xml><?xml version="1.0" encoding="utf-8"?>
+<w:document xmlns:w="http://schemas.openxmlformats.org/wordprocessingml/2006/main">
+  <w:body>
+    <w:p>
+      <w:r>
+        <w:t>Sample footer text</w:t>
+      </w:r>
+    </w:p>
+  </w:body>
+</w:document>
+</file>
+
+<file path=word/footnotes.xml><?xml version="1.0" encoding="utf-8"?>
+<w:document xmlns:w="http://schemas.openxmlformats.org/wordprocessingml/2006/main">
+  <w:body>
+    <w:p>
+      <w:r>
+        <w:t>Sample footnote text</w:t>
+      </w:r>
+    </w:p>
+  </w:body>
+</w:document>
+</file>
+
+<file path=word/header1.xml><?xml version="1.0" encoding="utf-8"?>
+<w:document xmlns:w="http://schemas.openxmlformats.org/wordprocessingml/2006/main">
+  <w:body>
+    <w:p>
+      <w:r>
+        <w:t>Sample header text</w:t>
+      </w:r>
+    </w:p>
+  </w:body>
+</w:document>
 </file>
</xml_diff>